<commit_message>
exp 3 final final
added link in the docx
</commit_message>
<xml_diff>
--- a/Exp3_WPL_109.docx
+++ b/Exp3_WPL_109.docx
@@ -29598,6 +29598,7 @@
             <w:r>
               <w:rPr>
                 <w:rFonts w:ascii="Times New Roman" w:eastAsia="Times New Roman" w:hAnsi="Times New Roman" w:cs="Times New Roman"/>
+                <w:noProof/>
                 <w:sz w:val="24"/>
                 <w:szCs w:val="24"/>
               </w:rPr>
@@ -29653,6 +29654,7 @@
             <w:r>
               <w:rPr>
                 <w:rFonts w:ascii="Times New Roman" w:eastAsia="Times New Roman" w:hAnsi="Times New Roman" w:cs="Times New Roman"/>
+                <w:noProof/>
                 <w:sz w:val="24"/>
                 <w:szCs w:val="24"/>
               </w:rPr>
@@ -29727,6 +29729,7 @@
             <w:r>
               <w:rPr>
                 <w:rFonts w:ascii="Times New Roman" w:eastAsia="Times New Roman" w:hAnsi="Times New Roman" w:cs="Times New Roman"/>
+                <w:noProof/>
                 <w:sz w:val="24"/>
                 <w:szCs w:val="24"/>
               </w:rPr>
@@ -29802,6 +29805,7 @@
             <w:r>
               <w:rPr>
                 <w:rFonts w:ascii="Times New Roman" w:eastAsia="Times New Roman" w:hAnsi="Times New Roman" w:cs="Times New Roman"/>
+                <w:noProof/>
                 <w:sz w:val="24"/>
                 <w:szCs w:val="24"/>
               </w:rPr>
@@ -29900,6 +29904,7 @@
             <w:r>
               <w:rPr>
                 <w:rFonts w:ascii="Times New Roman" w:eastAsia="Times New Roman" w:hAnsi="Times New Roman" w:cs="Times New Roman"/>
+                <w:noProof/>
                 <w:sz w:val="24"/>
                 <w:szCs w:val="24"/>
               </w:rPr>
@@ -29975,6 +29980,7 @@
             <w:r>
               <w:rPr>
                 <w:rFonts w:ascii="Times New Roman" w:eastAsia="Times New Roman" w:hAnsi="Times New Roman" w:cs="Times New Roman"/>
+                <w:noProof/>
                 <w:sz w:val="24"/>
                 <w:szCs w:val="24"/>
               </w:rPr>
@@ -30049,6 +30055,7 @@
             <w:r>
               <w:rPr>
                 <w:rFonts w:ascii="Times New Roman" w:eastAsia="Times New Roman" w:hAnsi="Times New Roman" w:cs="Times New Roman"/>
+                <w:noProof/>
                 <w:sz w:val="24"/>
                 <w:szCs w:val="24"/>
               </w:rPr>
@@ -30104,6 +30111,7 @@
             <w:r>
               <w:rPr>
                 <w:rFonts w:ascii="Times New Roman" w:eastAsia="Times New Roman" w:hAnsi="Times New Roman" w:cs="Times New Roman"/>
+                <w:noProof/>
                 <w:sz w:val="24"/>
                 <w:szCs w:val="24"/>
               </w:rPr>
@@ -30178,6 +30186,7 @@
             <w:r>
               <w:rPr>
                 <w:rFonts w:ascii="Times New Roman" w:eastAsia="Times New Roman" w:hAnsi="Times New Roman" w:cs="Times New Roman"/>
+                <w:noProof/>
                 <w:sz w:val="24"/>
                 <w:szCs w:val="24"/>
               </w:rPr>
@@ -31324,18 +31333,7 @@
                 <w:szCs w:val="24"/>
                 <w:lang w:val="en-IN"/>
               </w:rPr>
-              <w:t xml:space="preserve"> to identify the specific child element that was clicked. Delegation is beneficial when dealing with large lists or dynamically created elements. For example, in a to-do list application where items are frequently added or removed, attaching individual list</w:t>
-            </w:r>
-            <w:bookmarkStart w:id="0" w:name="_GoBack"/>
-            <w:bookmarkEnd w:id="0"/>
-            <w:r>
-              <w:rPr>
-                <w:rFonts w:ascii="Times New Roman" w:eastAsia="Times New Roman" w:hAnsi="Times New Roman" w:cs="Times New Roman"/>
-                <w:sz w:val="24"/>
-                <w:szCs w:val="24"/>
-                <w:lang w:val="en-IN"/>
-              </w:rPr>
-              <w:t>eners to each item would be inefficient. Instead, attaching one listener to the &lt;ul&gt; element allows it to handle clicks for all current and future &lt;li&gt; items, improving performance and reducing memory usage.</w:t>
+              <w:t xml:space="preserve"> to identify the specific child element that was clicked. Delegation is beneficial when dealing with large lists or dynamically created elements. For example, in a to-do list application where items are frequently added or removed, attaching individual listeners to each item would be inefficient. Instead, attaching one listener to the &lt;ul&gt; element allows it to handle clicks for all current and future &lt;li&gt; items, improving performance and reducing memory usage.</w:t>
             </w:r>
           </w:p>
         </w:tc>
@@ -31446,6 +31444,35 @@
               </w:rPr>
               <w:t>(students should write in your words)</w:t>
             </w:r>
+            <w:r>
+              <w:rPr>
+                <w:rFonts w:ascii="Times New Roman" w:eastAsia="Times New Roman" w:hAnsi="Times New Roman" w:cs="Times New Roman"/>
+                <w:sz w:val="24"/>
+                <w:szCs w:val="24"/>
+              </w:rPr>
+              <w:t xml:space="preserve"> Link: </w:t>
+            </w:r>
+            <w:hyperlink r:id="rId16" w:history="1">
+              <w:r>
+                <w:rPr>
+                  <w:rStyle w:val="Hyperlink"/>
+                  <w:rFonts w:ascii="Times New Roman" w:eastAsia="Times New Roman" w:hAnsi="Times New Roman" w:cs="Times New Roman"/>
+                  <w:sz w:val="24"/>
+                  <w:szCs w:val="24"/>
+                </w:rPr>
+                <w:t>https://github.com/PrathameshSJ/wpl-lab</w:t>
+              </w:r>
+            </w:hyperlink>
+            <w:r>
+              <w:rPr>
+                <w:rFonts w:ascii="Times New Roman" w:eastAsia="Times New Roman" w:hAnsi="Times New Roman" w:cs="Times New Roman"/>
+                <w:sz w:val="24"/>
+                <w:szCs w:val="24"/>
+              </w:rPr>
+              <w:t xml:space="preserve"> </w:t>
+            </w:r>
+            <w:bookmarkStart w:id="0" w:name="_GoBack"/>
+            <w:bookmarkEnd w:id="0"/>
           </w:p>
           <w:p>
             <w:pPr>
@@ -31696,8 +31723,8 @@
       </w:pPr>
     </w:p>
     <w:sectPr>
-      <w:headerReference w:type="default" r:id="rId16"/>
-      <w:footerReference w:type="default" r:id="rId17"/>
+      <w:headerReference w:type="default" r:id="rId17"/>
+      <w:footerReference w:type="default" r:id="rId18"/>
       <w:pgSz w:w="12240" w:h="15840"/>
       <w:pgMar w:top="1530" w:right="90" w:bottom="1440" w:left="1440" w:header="90" w:footer="0" w:gutter="0"/>
       <w:pgNumType w:start="1"/>
@@ -35743,7 +35770,6 @@
     <w:name w:val="Hyperlink"/>
     <w:basedOn w:val="DefaultParagraphFont"/>
     <w:uiPriority w:val="99"/>
-    <w:semiHidden/>
     <w:unhideWhenUsed/>
     <w:rsid w:val="003D7FDE"/>
     <w:rPr>
@@ -36458,6 +36484,18 @@
     <w:basedOn w:val="DefaultParagraphFont"/>
     <w:rsid w:val="00DF3AAF"/>
   </w:style>
+  <w:style w:type="character" w:styleId="UnresolvedMention">
+    <w:name w:val="Unresolved Mention"/>
+    <w:basedOn w:val="DefaultParagraphFont"/>
+    <w:uiPriority w:val="99"/>
+    <w:semiHidden/>
+    <w:unhideWhenUsed/>
+    <w:rsid w:val="00745935"/>
+    <w:rPr>
+      <w:color w:val="605E5C"/>
+      <w:shd w:val="clear" w:color="auto" w:fill="E1DFDD"/>
+    </w:rPr>
+  </w:style>
 </w:styles>
 </file>
 

</xml_diff>